<commit_message>
Point worksheet to the GitHub Pages simulation link
Co-Authored-By: Claude Opus 5.5 <noreply@anthropic.com>
Claude-Session: https://claude.ai/code/session_019PWEK8XfAM6dZUi4Yw79Rv
</commit_message>
<xml_diff>
--- a/Peat Bog Carbon Lab - Student Worksheet.docx
+++ b/Peat Bog Carbon Lab - Student Worksheet.docx
@@ -17,7 +17,13 @@
     </w:p>
     <w:p>
       <w:r>
-        <w:t>Simulation link: https://claude.ai/artifact/Mm8P6si3ZS32jwpArJJRcd</w:t>
+        <w:rPr>
+          <w:b/>
+        </w:rPr>
+        <w:t>Simulation link:</w:t>
+      </w:r>
+      <w:r>
+        <w:t xml:space="preserve"> https://smitka313.github.io/CarbonLab/</w:t>
       </w:r>
     </w:p>
     <w:p>

</xml_diff>

<commit_message>
Improve student usability of the simulator
- Keep the bog picture and rate boxes on screen while the controls scroll
- Add a phone number bar, a section jump menu, and bigger slider handles
- Always show the permafrost percentage, highlight active buttons, confirm Reset
- Show current bog settings in the Zombie fires panel
- Add matching shortcut notes to the worksheet

Co-Authored-By: Claude Opus 5.5 <noreply@anthropic.com>
Claude-Session: https://claude.ai/code/session_019PWEK8XfAM6dZUi4Yw79Rv
</commit_message>
<xml_diff>
--- a/Peat Bog Carbon Lab - Student Worksheet.docx
+++ b/Peat Bog Carbon Lab - Student Worksheet.docx
@@ -156,6 +156,70 @@
       </w:r>
       <w:r>
         <w:t>. This is where you will do most of your experiments.</w:t>
+      </w:r>
+    </w:p>
+    <w:p>
+      <w:pPr>
+        <w:spacing w:before="120" w:after="120"/>
+        <w:ind w:left="216" w:right="216"/>
+        <w:shd w:val="clear" w:color="auto" w:fill="E8F0F7"/>
+        <w:pBdr>
+          <w:left w:val="single" w:sz="24" w:space="6" w:color="2A78BD"/>
+        </w:pBdr>
+      </w:pPr>
+      <w:r>
+        <w:rPr>
+          <w:b/>
+        </w:rPr>
+        <w:t>Shortcut:</w:t>
+      </w:r>
+      <w:r>
+        <w:t xml:space="preserve"> The row of buttons at the very top of the screen (</w:t>
+      </w:r>
+      <w:r>
+        <w:rPr>
+          <w:b/>
+        </w:rPr>
+        <w:t>The bog</w:t>
+      </w:r>
+      <w:r>
+        <w:t xml:space="preserve">, </w:t>
+      </w:r>
+      <w:r>
+        <w:rPr>
+          <w:b/>
+        </w:rPr>
+        <w:t>Test one variable</w:t>
+      </w:r>
+      <w:r>
+        <w:t xml:space="preserve">, </w:t>
+      </w:r>
+      <w:r>
+        <w:rPr>
+          <w:b/>
+        </w:rPr>
+        <w:t>Zombie fires</w:t>
+      </w:r>
+      <w:r>
+        <w:t xml:space="preserve">, </w:t>
+      </w:r>
+      <w:r>
+        <w:rPr>
+          <w:b/>
+        </w:rPr>
+        <w:t>Data table</w:t>
+      </w:r>
+      <w:r>
+        <w:t xml:space="preserve">, </w:t>
+      </w:r>
+      <w:r>
+        <w:rPr>
+          <w:b/>
+        </w:rPr>
+        <w:t>Global warming</w:t>
+      </w:r>
+      <w:r>
+        <w:t>) jumps straight to that section. It stays at the top as you scroll.</w:t>
       </w:r>
     </w:p>
     <w:p>
@@ -5190,6 +5254,34 @@
       </w:r>
       <w:r>
         <w:t>Repeat for 50, 60, and 75.</w:t>
+      </w:r>
+    </w:p>
+    <w:p>
+      <w:pPr>
+        <w:spacing w:before="120" w:after="120"/>
+        <w:ind w:left="216" w:right="216"/>
+        <w:shd w:val="clear" w:color="auto" w:fill="E8F0F7"/>
+        <w:pBdr>
+          <w:left w:val="single" w:sz="24" w:space="6" w:color="2A78BD"/>
+        </w:pBdr>
+      </w:pPr>
+      <w:r>
+        <w:rPr>
+          <w:b/>
+        </w:rPr>
+        <w:t>Shortcut:</w:t>
+      </w:r>
+      <w:r>
+        <w:t xml:space="preserve"> In the Zombie fires section, the gray box </w:t>
+      </w:r>
+      <w:r>
+        <w:rPr>
+          <w:b/>
+        </w:rPr>
+        <w:t>Bog settings now</w:t>
+      </w:r>
+      <w:r>
+        <w:t xml:space="preserve"> (under the chance) shows the water level, oxygen in the peat, and burning. You can read those numbers there instead of scrolling up. You still change the water level in The bog.</w:t>
       </w:r>
     </w:p>
     <w:tbl>

</xml_diff>

<commit_message>
Use "carbon released to atmosphere" in place of "carbon source" everywhere
Updates the site's investigation prompt and Peat carbon sentence, and the
worksheet's practice question, Q7, word bank, and answer key.

Co-Authored-By: Claude Opus 5.5 <noreply@anthropic.com>
Claude-Session: https://claude.ai/code/session_019PWEK8XfAM6dZUi4Yw79Rv
</commit_message>
<xml_diff>
--- a/Peat Bog Carbon Lab - Student Worksheet.docx
+++ b/Peat Bog Carbon Lab - Student Worksheet.docx
@@ -974,7 +974,7 @@
         <w:t>PEAT CARBON</w:t>
       </w:r>
       <w:r>
-        <w:t xml:space="preserve"> box? __________ Is the number green (carbon sink: peat is growing) or red (carbon source: peat is shrinking)? __________</w:t>
+        <w:t xml:space="preserve"> box? __________ Is the number green (carbon sink: peat is growing) or red (carbon released to atmosphere: peat is shrinking)? __________</w:t>
       </w:r>
     </w:p>
     <w:p>
@@ -3192,7 +3192,7 @@
         <w:t>Q7.</w:t>
       </w:r>
       <w:r>
-        <w:t xml:space="preserve"> At 25 °C, is the bog a carbon sink or a carbon source? __________ Explain using your data.</w:t>
+        <w:t xml:space="preserve"> At 25 °C, is the bog a carbon sink, or is carbon being released to the atmosphere? __________ Explain using your data.</w:t>
       </w:r>
     </w:p>
     <w:p>
@@ -6902,7 +6902,7 @@
         <w:rPr>
           <w:i/>
         </w:rPr>
-        <w:t>photosynthesis, cellular respiration, decomposers, oxygen, water level, permafrost, burning, carbon sink, carbon source, opposite reactions.</w:t>
+        <w:t>photosynthesis, cellular respiration, decomposers, oxygen, water level, permafrost, burning, carbon sink, carbon released to atmosphere, opposite reactions.</w:t>
       </w:r>
     </w:p>
     <w:p>
@@ -6968,7 +6968,7 @@
     </w:p>
     <w:p>
       <w:r>
-        <w:t>After Reset: PEAT CARBON = +12, green (carbon sink). Drained bog: PEAT CARBON = −6, red (carbon source). Reset values: tilt 23.44°, summer temperature 10 °C, CO₂ 420 ppm, oxygen 21%, water level 75%, burning 0%.</w:t>
+        <w:t>After Reset: PEAT CARBON = +12, green (carbon sink). Drained bog: PEAT CARBON = −6, red (carbon released to atmosphere). Reset values: tilt 23.44°, summer temperature 10 °C, CO₂ 420 ppm, oxygen 21%, water level 75%, burning 0%.</w:t>
       </w:r>
     </w:p>
     <w:p>
@@ -8621,7 +8621,7 @@
     </w:p>
     <w:p>
       <w:r>
-        <w:t>5. About 18 °C. 6. Yes, decomposition keeps rising (it roughly doubles every 10 °C) while photosynthesis peaks and falls. 7. Carbon source: decomposition (53) is greater than photosynthesis (24).</w:t>
+        <w:t>5. About 18 °C. 6. Yes, decomposition keeps rising (it roughly doubles every 10 °C) while photosynthesis peaks and falls. 7. Carbon released to atmosphere: decomposition (53) is greater than photosynthesis (24).</w:t>
       </w:r>
     </w:p>
     <w:tbl>
@@ -10763,7 +10763,7 @@
         <w:t>Model note:</w:t>
       </w:r>
       <w:r>
-        <w:t xml:space="preserve"> in this simplified model, extra CO₂ also speeds up photosynthesis, so a wet bog in 2100 can still show a small positive Net. Use this to discuss that thawed peat has lost its permafrost protection and that drying and fire can quickly flip it to a carbon source.</w:t>
+        <w:t xml:space="preserve"> in this simplified model, extra CO₂ also speeds up photosynthesis, so a wet bog in 2100 can still show a small positive Net. Use this to discuss that thawed peat has lost its permafrost protection and that drying and fire can quickly flip it to releasing carbon to the atmosphere.</w:t>
       </w:r>
     </w:p>
     <w:sectPr>

</xml_diff>